<commit_message>
BAN DIEN SAN in-place: ap dung cung rule placeholder format — bo bold cho red placeholder trong body, giu bold cho header. Tuong tu BAN MAU. Rule da save memory feedback_placeholder_format
</commit_message>
<xml_diff>
--- a/bai-bao-Q1/MauQD_HoiDongDaoDuc_DIENSAN_08062026.docx
+++ b/bai-bao-Q1/MauQD_HoiDongDaoDuc_DIENSAN_08062026.docx
@@ -161,7 +161,7 @@
             <w:r>
               <w:rPr>
                 <w:rFonts w:ascii="Times New Roman" w:hAnsi="Times New Roman"/>
-                <w:b/>
+                <w:b w:val="0"/>
                 <w:i/>
                 <w:color w:val="C00000"/>
                 <w:sz w:val="22"/>
@@ -179,7 +179,7 @@
             <w:r>
               <w:rPr>
                 <w:rFonts w:ascii="Times New Roman" w:hAnsi="Times New Roman"/>
-                <w:b/>
+                <w:b w:val="0"/>
                 <w:i/>
                 <w:color w:val="C00000"/>
                 <w:sz w:val="22"/>
@@ -272,7 +272,7 @@
       <w:r>
         <w:rPr>
           <w:rFonts w:ascii="Times New Roman" w:hAnsi="Times New Roman"/>
-          <w:b/>
+          <w:b w:val="0"/>
           <w:i/>
           <w:color w:val="C00000"/>
           <w:sz w:val="24"/>
@@ -290,7 +290,7 @@
       <w:r>
         <w:rPr>
           <w:rFonts w:ascii="Times New Roman" w:hAnsi="Times New Roman"/>
-          <w:b/>
+          <w:b w:val="0"/>
           <w:i/>
           <w:color w:val="C00000"/>
           <w:sz w:val="24"/>
@@ -338,7 +338,7 @@
       <w:r>
         <w:rPr>
           <w:rFonts w:ascii="Times New Roman" w:hAnsi="Times New Roman"/>
-          <w:b/>
+          <w:b w:val="0"/>
           <w:i/>
           <w:color w:val="C00000"/>
           <w:sz w:val="24"/>
@@ -356,7 +356,7 @@
       <w:r>
         <w:rPr>
           <w:rFonts w:ascii="Times New Roman" w:hAnsi="Times New Roman"/>
-          <w:b/>
+          <w:b w:val="0"/>
           <w:i/>
           <w:color w:val="C00000"/>
           <w:sz w:val="24"/>

</xml_diff>